<commit_message>
Intro ING: la evaluacion de corte no se detalla en el deck, sin plataforma ni porcentajes
Co-Authored-By: Claude Opus 5.5 <noreply@anthropic.com>
</commit_message>
<xml_diff>
--- a/Introduccion a la Ingenieria/Kit docente/Clase 11/Guion Docente Clase 11 - Taller de prototipado inicial con IA.docx
+++ b/Introduccion a la Ingenieria/Kit docente/Clase 11/Guion Docente Clase 11 - Taller de prototipado inicial con IA.docx
@@ -267,7 +267,7 @@
           <w:color w:val="4A4A49"/>
           <w:sz w:val="21"/>
         </w:rPr>
-        <w:t>Esta sesión cierra el corte 2 (30 %).</w:t>
+        <w:t>Esta sesión cierra el corte 2.</w:t>
       </w:r>
       <w:r>
         <w:rPr>
@@ -276,7 +276,7 @@
           <w:color w:val="4A4A49"/>
           <w:sz w:val="21"/>
         </w:rPr>
-        <w:t xml:space="preserve"> La teoría baja a 17 minutos y la actividad a 27 para que quepan los </w:t>
+        <w:t xml:space="preserve"> La teoría baja a 17 minutos para que quepan los </w:t>
       </w:r>
       <w:r>
         <w:rPr>
@@ -294,7 +294,7 @@
           <w:color w:val="4A4A49"/>
           <w:sz w:val="21"/>
         </w:rPr>
-        <w:t xml:space="preserve"> al final, en ExamLab, sobre las sesiones 7 a 11. Es además la </w:t>
+        <w:t xml:space="preserve"> al final, sobre lo visto en el corte hasta hoy. Es además la </w:t>
       </w:r>
       <w:r>
         <w:rPr>
@@ -312,7 +312,7 @@
           <w:color w:val="4A4A49"/>
           <w:sz w:val="21"/>
         </w:rPr>
-        <w:t xml:space="preserve"> —la otra fue la sesión 3—, y aplica la misma regla, hoy con más peso: se entrega el prompt usado y la lista de lo que se corrigió a mano.</w:t>
+        <w:t xml:space="preserve"> —la otra fue la sesión 3—.</w:t>
       </w:r>
     </w:p>
     <w:p>
@@ -764,7 +764,7 @@
           <w:color w:val="4A4A49"/>
           <w:sz w:val="22"/>
         </w:rPr>
-        <w:t xml:space="preserve"> → diapositivas 8 y 9</w:t>
+        <w:t xml:space="preserve"> → diapositiva 8</w:t>
       </w:r>
     </w:p>
     <w:p>
@@ -880,7 +880,7 @@
           <w:color w:val="1A1C1D"/>
           <w:sz w:val="32"/>
         </w:rPr>
-        <w:t>00:08–00:25 · Teoría (17 min) · [Slide 5][Slide 6][Slide 8][Slide 9]</w:t>
+        <w:t>00:08–00:25 · Teoría (17 min) · [Slide 5][Slide 6][Slide 8][fuera del deck · guía del taller en la carpeta]</w:t>
       </w:r>
     </w:p>
     <w:p>
@@ -1022,7 +1022,7 @@
           <w:color w:val="4A4A49"/>
           <w:sz w:val="22"/>
         </w:rPr>
-        <w:t xml:space="preserve"> · Cómo cierra el corte [Slide 9]. Diga que es a libro abierto </w:t>
+        <w:t xml:space="preserve"> · Cómo cierra el corte [fuera del deck · guía del taller en la carpeta]. Diga que es a libro abierto </w:t>
       </w:r>
       <w:r>
         <w:rPr>
@@ -1319,7 +1319,7 @@
           <w:color w:val="1A1C1D"/>
           <w:sz w:val="32"/>
         </w:rPr>
-        <w:t>01:07–01:27 · Evaluación del corte 2 en ExamLab (20 min) · [Slide 9]</w:t>
+        <w:t>01:07–01:27 · Evaluación del corte 2 en ExamLab (20 min) · [fuera del deck · guía del taller en la carpeta]</w:t>
       </w:r>
     </w:p>
     <w:p>
@@ -1446,7 +1446,7 @@
           <w:color w:val="1A1C1D"/>
           <w:sz w:val="32"/>
         </w:rPr>
-        <w:t>01:27–01:30 · Cierre · [fuera del deck · guía del taller en la carpeta][Slide 10]</w:t>
+        <w:t>01:27–01:30 · Cierre · [fuera del deck · guía del taller en la carpeta][Slide 9]</w:t>
       </w:r>
     </w:p>
     <w:p>
@@ -1685,19 +1685,6 @@
           <w:sz w:val="22"/>
         </w:rPr>
         <w:t>La variante de la IA y la corrección del equipo</w:t>
-      </w:r>
-    </w:p>
-    <w:p>
-      <w:pPr>
-        <w:pStyle w:val="ListNumber"/>
-      </w:pPr>
-      <w:r>
-        <w:rPr>
-          <w:b w:val="0"/>
-          <w:color w:val="4A4A49"/>
-          <w:sz w:val="22"/>
-        </w:rPr>
-        <w:t>Cómo cierra el corte 2 hoy</w:t>
       </w:r>
     </w:p>
     <w:p>

</xml_diff>